<commit_message>
Made tutorial levels and added stars
I'm actually done! Now I'll need to coerce some play testers, do art, and some other stuff
</commit_message>
<xml_diff>
--- a/Placeholder script.docx
+++ b/Placeholder script.docx
@@ -38,9 +38,26 @@
         <w:t>How do I start a project again?</w:t>
       </w:r>
       <w:r>
-        <w:t xml:space="preserve"> / Now what?</w:t>
+        <w:t xml:space="preserve"> / </w:t>
+      </w:r>
+      <w:r>
+        <w:t xml:space="preserve">Furiously type three lines / </w:t>
+      </w:r>
+      <w:r>
+        <w:t>Now what?</w:t>
       </w:r>
     </w:p>
+    <w:p>
+      <w:r>
+        <w:t>Theft / of my own code</w:t>
+      </w:r>
+    </w:p>
+    <w:p>
+      <w:r>
+        <w:t>TWEENS / youtube shorts game dev says they: make game 10X better; cures cancer/ I don’t have cancer but… / I DON’T KNOW WHAT A TWEEN IS</w:t>
+      </w:r>
+    </w:p>
+    <w:p/>
     <w:p/>
     <w:p/>
     <w:p/>

</xml_diff>